<commit_message>
feat: cap nhat thong tin sinh vien Pham Van Minh (MSV: 23010350, DH Phenikaa) vao bao cao Word va tao bo Slide PowerPoint (.pptx) 16:9 hoan chinh
</commit_message>
<xml_diff>
--- a/docs/Bao_Cao_Chi_Tiet_Du_An_House_Prediction.docx
+++ b/docs/Bao_Cao_Chi_Tiet_Du_An_House_Prediction.docx
@@ -22,6 +22,23 @@
     <w:p>
       <w:pPr>
         <w:jc w:val="center"/>
+        <w:spacing w:before="0" w:after="40" w:line="300" w:lineRule="auto"/>
+      </w:pPr>
+      <w:r>
+        <w:rPr>
+          <w:rFonts w:ascii="Times New Roman" w:hAnsi="Times New Roman"/>
+          <w:b/>
+          <w:i w:val="0"/>
+          <w:color w:val="000000"/>
+          <w:sz w:val="28"/>
+          <w:rFonts w:ascii="Times New Roman" w:hAnsi="Times New Roman" w:cs="Times New Roman" w:eastAsia="Times New Roman"/>
+        </w:rPr>
+        <w:t>TRƯỜNG ĐẠI HỌC PHENIKAA</w:t>
+      </w:r>
+    </w:p>
+    <w:p>
+      <w:pPr>
+        <w:jc w:val="center"/>
         <w:spacing w:before="0" w:after="400" w:line="300" w:lineRule="auto"/>
       </w:pPr>
       <w:r>
@@ -33,13 +50,13 @@
           <w:sz w:val="26"/>
           <w:rFonts w:ascii="Times New Roman" w:hAnsi="Times New Roman" w:cs="Times New Roman" w:eastAsia="Times New Roman"/>
         </w:rPr>
-        <w:t>TRƯỜNG ĐẠI HỌC KHOA HỌC TỰ NHIÊN / BỘ MÔN KHOA HỌC DỮ LIỆU</w:t>
+        <w:t>TRƯỜNG CÔNG NGHỆ THÔNG TIN</w:t>
       </w:r>
     </w:p>
     <w:p>
       <w:pPr>
         <w:jc w:val="center"/>
-        <w:spacing w:before="0" w:after="600" w:line="300" w:lineRule="auto"/>
+        <w:spacing w:before="0" w:after="500" w:line="300" w:lineRule="auto"/>
       </w:pPr>
       <w:r>
         <w:rPr>
@@ -73,7 +90,7 @@
     <w:p>
       <w:pPr>
         <w:jc w:val="center"/>
-        <w:spacing w:before="0" w:after="600" w:line="300" w:lineRule="auto"/>
+        <w:spacing w:before="0" w:after="500" w:line="300" w:lineRule="auto"/>
       </w:pPr>
       <w:r>
         <w:rPr>
@@ -107,7 +124,7 @@
     <w:p>
       <w:pPr>
         <w:jc w:val="center"/>
-        <w:spacing w:before="0" w:after="800" w:line="300" w:lineRule="auto"/>
+        <w:spacing w:before="0" w:after="600" w:line="300" w:lineRule="auto"/>
       </w:pPr>
       <w:r>
         <w:rPr>
@@ -124,7 +141,7 @@
     <w:p>
       <w:pPr>
         <w:jc w:val="center"/>
-        <w:spacing w:before="0" w:after="800" w:line="300" w:lineRule="auto"/>
+        <w:spacing w:before="0" w:after="600" w:line="300" w:lineRule="auto"/>
       </w:pPr>
       <w:r>
         <w:rPr>
@@ -210,7 +227,7 @@
                 <w:sz w:val="22"/>
                 <w:rFonts w:ascii="Times New Roman" w:hAnsi="Times New Roman" w:cs="Times New Roman" w:eastAsia="Times New Roman"/>
               </w:rPr>
-              <w:t>Công nghệ chủ đạo:</w:t>
+              <w:t>Sinh viên thực hiện:</w:t>
             </w:r>
           </w:p>
         </w:tc>
@@ -231,7 +248,7 @@
                 <w:sz w:val="22"/>
                 <w:rFonts w:ascii="Times New Roman" w:hAnsi="Times New Roman" w:cs="Times New Roman" w:eastAsia="Times New Roman"/>
               </w:rPr>
-              <w:t>Apache PySpark, Parquet Snappy, PostgreSQL, LightGBM, Streamlit</w:t>
+              <w:t>Phạm Văn Minh</w:t>
             </w:r>
           </w:p>
         </w:tc>
@@ -254,7 +271,7 @@
                 <w:sz w:val="22"/>
                 <w:rFonts w:ascii="Times New Roman" w:hAnsi="Times New Roman" w:cs="Times New Roman" w:eastAsia="Times New Roman"/>
               </w:rPr>
-              <w:t>Quy mô dữ liệu thực nghiệm:</w:t>
+              <w:t>Mã sinh viên (MSV):</w:t>
             </w:r>
           </w:p>
         </w:tc>
@@ -275,7 +292,7 @@
                 <w:sz w:val="22"/>
                 <w:rFonts w:ascii="Times New Roman" w:hAnsi="Times New Roman" w:cs="Times New Roman" w:eastAsia="Times New Roman"/>
               </w:rPr>
-              <w:t>350,075 bản ghi thô (1 Shard), kho nguồn 3,500,744 bản ghi (10 Shards)</w:t>
+              <w:t>23010350</w:t>
             </w:r>
           </w:p>
         </w:tc>
@@ -298,6 +315,182 @@
                 <w:sz w:val="22"/>
                 <w:rFonts w:ascii="Times New Roman" w:hAnsi="Times New Roman" w:cs="Times New Roman" w:eastAsia="Times New Roman"/>
               </w:rPr>
+              <w:t>Email sinh viên:</w:t>
+            </w:r>
+          </w:p>
+        </w:tc>
+        <w:tc>
+          <w:tcPr>
+            <w:tcW w:type="dxa" w:w="5472"/>
+          </w:tcPr>
+          <w:p>
+            <w:pPr>
+              <w:jc w:val="left"/>
+            </w:pPr>
+            <w:r>
+              <w:rPr>
+                <w:rFonts w:ascii="Times New Roman" w:hAnsi="Times New Roman"/>
+                <w:b w:val="0"/>
+                <w:i w:val="0"/>
+                <w:color w:val="000000"/>
+                <w:sz w:val="22"/>
+                <w:rFonts w:ascii="Times New Roman" w:hAnsi="Times New Roman" w:cs="Times New Roman" w:eastAsia="Times New Roman"/>
+              </w:rPr>
+              <w:t>23010350@st.phenikaa-uni.edu.vn</w:t>
+            </w:r>
+          </w:p>
+        </w:tc>
+      </w:tr>
+      <w:tr>
+        <w:tc>
+          <w:tcPr>
+            <w:tcW w:type="dxa" w:w="3600"/>
+          </w:tcPr>
+          <w:p>
+            <w:pPr>
+              <w:jc w:val="left"/>
+            </w:pPr>
+            <w:r>
+              <w:rPr>
+                <w:rFonts w:ascii="Times New Roman" w:hAnsi="Times New Roman"/>
+                <w:b/>
+                <w:i w:val="0"/>
+                <w:color w:val="000000"/>
+                <w:sz w:val="22"/>
+                <w:rFonts w:ascii="Times New Roman" w:hAnsi="Times New Roman" w:cs="Times New Roman" w:eastAsia="Times New Roman"/>
+              </w:rPr>
+              <w:t>Đơn vị đào tạo:</w:t>
+            </w:r>
+          </w:p>
+        </w:tc>
+        <w:tc>
+          <w:tcPr>
+            <w:tcW w:type="dxa" w:w="5472"/>
+          </w:tcPr>
+          <w:p>
+            <w:pPr>
+              <w:jc w:val="left"/>
+            </w:pPr>
+            <w:r>
+              <w:rPr>
+                <w:rFonts w:ascii="Times New Roman" w:hAnsi="Times New Roman"/>
+                <w:b w:val="0"/>
+                <w:i w:val="0"/>
+                <w:color w:val="000000"/>
+                <w:sz w:val="22"/>
+                <w:rFonts w:ascii="Times New Roman" w:hAnsi="Times New Roman" w:cs="Times New Roman" w:eastAsia="Times New Roman"/>
+              </w:rPr>
+              <w:t>Trường Công nghệ Thông tin - Trường Đại học Phenikaa</w:t>
+            </w:r>
+          </w:p>
+        </w:tc>
+      </w:tr>
+      <w:tr>
+        <w:tc>
+          <w:tcPr>
+            <w:tcW w:type="dxa" w:w="3600"/>
+          </w:tcPr>
+          <w:p>
+            <w:pPr>
+              <w:jc w:val="left"/>
+            </w:pPr>
+            <w:r>
+              <w:rPr>
+                <w:rFonts w:ascii="Times New Roman" w:hAnsi="Times New Roman"/>
+                <w:b/>
+                <w:i w:val="0"/>
+                <w:color w:val="000000"/>
+                <w:sz w:val="22"/>
+                <w:rFonts w:ascii="Times New Roman" w:hAnsi="Times New Roman" w:cs="Times New Roman" w:eastAsia="Times New Roman"/>
+              </w:rPr>
+              <w:t>Công nghệ chủ đạo:</w:t>
+            </w:r>
+          </w:p>
+        </w:tc>
+        <w:tc>
+          <w:tcPr>
+            <w:tcW w:type="dxa" w:w="5472"/>
+          </w:tcPr>
+          <w:p>
+            <w:pPr>
+              <w:jc w:val="left"/>
+            </w:pPr>
+            <w:r>
+              <w:rPr>
+                <w:rFonts w:ascii="Times New Roman" w:hAnsi="Times New Roman"/>
+                <w:b w:val="0"/>
+                <w:i w:val="0"/>
+                <w:color w:val="000000"/>
+                <w:sz w:val="22"/>
+                <w:rFonts w:ascii="Times New Roman" w:hAnsi="Times New Roman" w:cs="Times New Roman" w:eastAsia="Times New Roman"/>
+              </w:rPr>
+              <w:t>Apache PySpark, Parquet Snappy, PostgreSQL/SQLite, LightGBM, Streamlit</w:t>
+            </w:r>
+          </w:p>
+        </w:tc>
+      </w:tr>
+      <w:tr>
+        <w:tc>
+          <w:tcPr>
+            <w:tcW w:type="dxa" w:w="3600"/>
+          </w:tcPr>
+          <w:p>
+            <w:pPr>
+              <w:jc w:val="left"/>
+            </w:pPr>
+            <w:r>
+              <w:rPr>
+                <w:rFonts w:ascii="Times New Roman" w:hAnsi="Times New Roman"/>
+                <w:b/>
+                <w:i w:val="0"/>
+                <w:color w:val="000000"/>
+                <w:sz w:val="22"/>
+                <w:rFonts w:ascii="Times New Roman" w:hAnsi="Times New Roman" w:cs="Times New Roman" w:eastAsia="Times New Roman"/>
+              </w:rPr>
+              <w:t>Quy mô dữ liệu thực nghiệm:</w:t>
+            </w:r>
+          </w:p>
+        </w:tc>
+        <w:tc>
+          <w:tcPr>
+            <w:tcW w:type="dxa" w:w="5472"/>
+          </w:tcPr>
+          <w:p>
+            <w:pPr>
+              <w:jc w:val="left"/>
+            </w:pPr>
+            <w:r>
+              <w:rPr>
+                <w:rFonts w:ascii="Times New Roman" w:hAnsi="Times New Roman"/>
+                <w:b w:val="0"/>
+                <w:i w:val="0"/>
+                <w:color w:val="000000"/>
+                <w:sz w:val="22"/>
+                <w:rFonts w:ascii="Times New Roman" w:hAnsi="Times New Roman" w:cs="Times New Roman" w:eastAsia="Times New Roman"/>
+              </w:rPr>
+              <w:t>350,075 bản ghi thô (Shard 0000), kho nguồn 3,500,744 bản ghi (10 Shards)</w:t>
+            </w:r>
+          </w:p>
+        </w:tc>
+      </w:tr>
+      <w:tr>
+        <w:tc>
+          <w:tcPr>
+            <w:tcW w:type="dxa" w:w="3600"/>
+          </w:tcPr>
+          <w:p>
+            <w:pPr>
+              <w:jc w:val="left"/>
+            </w:pPr>
+            <w:r>
+              <w:rPr>
+                <w:rFonts w:ascii="Times New Roman" w:hAnsi="Times New Roman"/>
+                <w:b/>
+                <w:i w:val="0"/>
+                <w:color w:val="000000"/>
+                <w:sz w:val="22"/>
+                <w:rFonts w:ascii="Times New Roman" w:hAnsi="Times New Roman" w:cs="Times New Roman" w:eastAsia="Times New Roman"/>
+              </w:rPr>
               <w:t>Thời gian thực hiện:</w:t>
             </w:r>
           </w:p>
@@ -319,7 +512,7 @@
                 <w:sz w:val="22"/>
                 <w:rFonts w:ascii="Times New Roman" w:hAnsi="Times New Roman" w:cs="Times New Roman" w:eastAsia="Times New Roman"/>
               </w:rPr>
-              <w:t>Sprint 2 Tuần (Tháng 10/2026)</w:t>
+              <w:t>Sprint 2 Tuần (Năm 2026)</w:t>
             </w:r>
           </w:p>
         </w:tc>
@@ -17119,7 +17312,7 @@
         <w:sz w:val="19"/>
         <w:rFonts w:ascii="Times New Roman" w:hAnsi="Times New Roman" w:cs="Times New Roman" w:eastAsia="Times New Roman"/>
       </w:rPr>
-      <w:t xml:space="preserve">Báo Cáo Đồ Án Tích Hợp Dữ Liệu Lớn | </w:t>
+      <w:t xml:space="preserve">Báo Cáo Đồ Án - SV: Phạm Văn Minh (MSV: 23010350) - ĐH Phenikaa | </w:t>
     </w:r>
     <w:r>
       <w:rPr>

</xml_diff>